<commit_message>
Added hardware and version
</commit_message>
<xml_diff>
--- a/Documentation/Open Energy Gateway User Documentation.docx
+++ b/Documentation/Open Energy Gateway User Documentation.docx
@@ -282,13 +282,25 @@
           <w:bCs/>
           <w:lang w:val="en-GB"/>
         </w:rPr>
-        <w:t xml:space="preserve">. </w:t>
-      </w:r>
-      <w:r>
-        <w:rPr>
-          <w:lang w:val="en-GB"/>
-        </w:rPr>
-        <w:t>If it does not automatically go to this IP address, then enter the IP address in you browser.</w:t>
+        <w:t xml:space="preserve"> </w:t>
+      </w:r>
+      <w:r>
+        <w:rPr>
+          <w:lang w:val="en-GB"/>
+        </w:rPr>
+        <w:t xml:space="preserve">If it does not automatically go to this IP address, then enter the IP address in </w:t>
+      </w:r>
+      <w:r>
+        <w:rPr>
+          <w:lang w:val="en-GB"/>
+        </w:rPr>
+        <w:t>your</w:t>
+      </w:r>
+      <w:r>
+        <w:rPr>
+          <w:lang w:val="en-GB"/>
+        </w:rPr>
+        <w:t xml:space="preserve"> browser.</w:t>
       </w:r>
     </w:p>
     <w:p>
@@ -313,6 +325,401 @@
       <w:pPr>
         <w:pStyle w:val="ListParagraph"/>
         <w:numPr>
+          <w:ilvl w:val="0"/>
+          <w:numId w:val="1"/>
+        </w:numPr>
+        <w:rPr>
+          <w:lang w:val="en-GB"/>
+        </w:rPr>
+      </w:pPr>
+      <w:r>
+        <w:rPr>
+          <w:lang w:val="en-GB"/>
+        </w:rPr>
+        <w:t>Tap on “Configure WiFi”</w:t>
+      </w:r>
+    </w:p>
+    <w:p>
+      <w:pPr>
+        <w:pStyle w:val="ListParagraph"/>
+        <w:numPr>
+          <w:ilvl w:val="0"/>
+          <w:numId w:val="1"/>
+        </w:numPr>
+        <w:rPr>
+          <w:lang w:val="en-GB"/>
+        </w:rPr>
+      </w:pPr>
+      <w:r>
+        <w:rPr>
+          <w:lang w:val="en-GB"/>
+        </w:rPr>
+        <w:t>Then a screen will come up listing all the available Wifi networks. Select the WiFi you want to connect to here.</w:t>
+      </w:r>
+    </w:p>
+    <w:p>
+      <w:pPr>
+        <w:pStyle w:val="ListParagraph"/>
+        <w:numPr>
+          <w:ilvl w:val="0"/>
+          <w:numId w:val="1"/>
+        </w:numPr>
+        <w:rPr>
+          <w:lang w:val="en-GB"/>
+        </w:rPr>
+      </w:pPr>
+      <w:r>
+        <w:rPr>
+          <w:lang w:val="en-GB"/>
+        </w:rPr>
+        <w:t>Type in you WiFi password and tap save.</w:t>
+      </w:r>
+    </w:p>
+    <w:p>
+      <w:pPr>
+        <w:ind w:left="3370" w:hanging="3370"/>
+        <w:rPr>
+          <w:lang w:val="en-GB"/>
+        </w:rPr>
+      </w:pPr>
+      <w:r>
+        <w:rPr>
+          <w:lang w:val="en-GB"/>
+        </w:rPr>
+        <w:t>1.</w:t>
+      </w:r>
+      <w:r>
+        <w:rPr>
+          <w:lang w:val="en-GB"/>
+        </w:rPr>
+        <w:t xml:space="preserve"> </w:t>
+      </w:r>
+      <w:r>
+        <w:rPr>
+          <w:lang w:val="en-GB"/>
+        </w:rPr>
+        <w:t>Click on “Configure WiFi”</w:t>
+      </w:r>
+      <w:r>
+        <w:rPr>
+          <w:lang w:val="en-GB"/>
+        </w:rPr>
+        <w:tab/>
+      </w:r>
+      <w:r>
+        <w:rPr>
+          <w:lang w:val="en-GB"/>
+        </w:rPr>
+        <w:t xml:space="preserve">2. </w:t>
+      </w:r>
+      <w:r>
+        <w:rPr>
+          <w:lang w:val="en-GB"/>
+        </w:rPr>
+        <w:t>Click on your WiFi network</w:t>
+      </w:r>
+      <w:r>
+        <w:rPr>
+          <w:lang w:val="en-GB"/>
+        </w:rPr>
+        <w:tab/>
+      </w:r>
+      <w:r>
+        <w:rPr>
+          <w:lang w:val="en-GB"/>
+        </w:rPr>
+        <w:t xml:space="preserve">3. </w:t>
+      </w:r>
+      <w:r>
+        <w:rPr>
+          <w:lang w:val="en-GB"/>
+        </w:rPr>
+        <w:t>Click Save.</w:t>
+      </w:r>
+      <w:r>
+        <w:rPr>
+          <w:lang w:val="en-GB"/>
+        </w:rPr>
+        <w:br/>
+        <w:t>Enter your password.</w:t>
+      </w:r>
+    </w:p>
+    <w:p>
+      <w:pPr>
+        <w:rPr>
+          <w:lang w:val="en-GB"/>
+        </w:rPr>
+      </w:pPr>
+      <w:r>
+        <w:rPr>
+          <w:noProof/>
+          <w:lang w:val="en-GB"/>
+        </w:rPr>
+        <w:drawing>
+          <wp:anchor distT="0" distB="0" distL="114300" distR="114300" simplePos="0" relativeHeight="251659264" behindDoc="1" locked="0" layoutInCell="1" allowOverlap="1" wp14:anchorId="52C42492" wp14:editId="2CABE78C">
+            <wp:simplePos x="0" y="0"/>
+            <wp:positionH relativeFrom="margin">
+              <wp:align>right</wp:align>
+            </wp:positionH>
+            <wp:positionV relativeFrom="paragraph">
+              <wp:posOffset>2540</wp:posOffset>
+            </wp:positionV>
+            <wp:extent cx="1712595" cy="3672840"/>
+            <wp:effectExtent l="0" t="0" r="1905" b="3810"/>
+            <wp:wrapNone/>
+            <wp:docPr id="2017535996" name="Picture 2" descr="A screenshot of a login screen"/>
+            <wp:cNvGraphicFramePr>
+              <a:graphicFrameLocks xmlns:a="http://schemas.openxmlformats.org/drawingml/2006/main" noChangeAspect="1"/>
+            </wp:cNvGraphicFramePr>
+            <a:graphic xmlns:a="http://schemas.openxmlformats.org/drawingml/2006/main">
+              <a:graphicData uri="http://schemas.openxmlformats.org/drawingml/2006/picture">
+                <pic:pic xmlns:pic="http://schemas.openxmlformats.org/drawingml/2006/picture">
+                  <pic:nvPicPr>
+                    <pic:cNvPr id="2017535996" name="Picture 2" descr="A screenshot of a login screen"/>
+                    <pic:cNvPicPr/>
+                  </pic:nvPicPr>
+                  <pic:blipFill>
+                    <a:blip r:embed="rId5" cstate="print">
+                      <a:extLst>
+                        <a:ext uri="{28A0092B-C50C-407E-A947-70E740481C1C}">
+                          <a14:useLocalDpi xmlns:a14="http://schemas.microsoft.com/office/drawing/2010/main" val="0"/>
+                        </a:ext>
+                      </a:extLst>
+                    </a:blip>
+                    <a:stretch>
+                      <a:fillRect/>
+                    </a:stretch>
+                  </pic:blipFill>
+                  <pic:spPr>
+                    <a:xfrm>
+                      <a:off x="0" y="0"/>
+                      <a:ext cx="1712595" cy="3672840"/>
+                    </a:xfrm>
+                    <a:prstGeom prst="rect">
+                      <a:avLst/>
+                    </a:prstGeom>
+                  </pic:spPr>
+                </pic:pic>
+              </a:graphicData>
+            </a:graphic>
+            <wp14:sizeRelH relativeFrom="margin">
+              <wp14:pctWidth>0</wp14:pctWidth>
+            </wp14:sizeRelH>
+            <wp14:sizeRelV relativeFrom="margin">
+              <wp14:pctHeight>0</wp14:pctHeight>
+            </wp14:sizeRelV>
+          </wp:anchor>
+        </w:drawing>
+      </w:r>
+      <w:r>
+        <w:rPr>
+          <w:noProof/>
+          <w:lang w:val="en-GB"/>
+        </w:rPr>
+        <w:drawing>
+          <wp:anchor distT="0" distB="0" distL="114300" distR="114300" simplePos="0" relativeHeight="251658240" behindDoc="1" locked="0" layoutInCell="1" allowOverlap="1" wp14:anchorId="35E98A2C" wp14:editId="049F281B">
+            <wp:simplePos x="0" y="0"/>
+            <wp:positionH relativeFrom="margin">
+              <wp:align>left</wp:align>
+            </wp:positionH>
+            <wp:positionV relativeFrom="paragraph">
+              <wp:posOffset>242570</wp:posOffset>
+            </wp:positionV>
+            <wp:extent cx="1742440" cy="3736340"/>
+            <wp:effectExtent l="0" t="0" r="0" b="0"/>
+            <wp:wrapNone/>
+            <wp:docPr id="1137550407" name="Picture 1" descr="A screenshot of a phone&#10;&#10;AI-generated content may be incorrect."/>
+            <wp:cNvGraphicFramePr>
+              <a:graphicFrameLocks xmlns:a="http://schemas.openxmlformats.org/drawingml/2006/main" noChangeAspect="1"/>
+            </wp:cNvGraphicFramePr>
+            <a:graphic xmlns:a="http://schemas.openxmlformats.org/drawingml/2006/main">
+              <a:graphicData uri="http://schemas.openxmlformats.org/drawingml/2006/picture">
+                <pic:pic xmlns:pic="http://schemas.openxmlformats.org/drawingml/2006/picture">
+                  <pic:nvPicPr>
+                    <pic:cNvPr id="1137550407" name="Picture 1" descr="A screenshot of a phone&#10;&#10;AI-generated content may be incorrect."/>
+                    <pic:cNvPicPr/>
+                  </pic:nvPicPr>
+                  <pic:blipFill>
+                    <a:blip r:embed="rId6" cstate="print">
+                      <a:extLst>
+                        <a:ext uri="{28A0092B-C50C-407E-A947-70E740481C1C}">
+                          <a14:useLocalDpi xmlns:a14="http://schemas.microsoft.com/office/drawing/2010/main" val="0"/>
+                        </a:ext>
+                      </a:extLst>
+                    </a:blip>
+                    <a:stretch>
+                      <a:fillRect/>
+                    </a:stretch>
+                  </pic:blipFill>
+                  <pic:spPr>
+                    <a:xfrm>
+                      <a:off x="0" y="0"/>
+                      <a:ext cx="1742440" cy="3736340"/>
+                    </a:xfrm>
+                    <a:prstGeom prst="rect">
+                      <a:avLst/>
+                    </a:prstGeom>
+                  </pic:spPr>
+                </pic:pic>
+              </a:graphicData>
+            </a:graphic>
+            <wp14:sizeRelV relativeFrom="margin">
+              <wp14:pctHeight>0</wp14:pctHeight>
+            </wp14:sizeRelV>
+          </wp:anchor>
+        </w:drawing>
+      </w:r>
+      <w:r>
+        <w:rPr>
+          <w:lang w:val="en-GB"/>
+        </w:rPr>
+        <w:drawing>
+          <wp:anchor distT="0" distB="0" distL="114300" distR="114300" simplePos="0" relativeHeight="251660288" behindDoc="0" locked="0" layoutInCell="1" allowOverlap="1" wp14:anchorId="11C4F0C3" wp14:editId="25FC10B8">
+            <wp:simplePos x="0" y="0"/>
+            <wp:positionH relativeFrom="margin">
+              <wp:posOffset>2060557</wp:posOffset>
+            </wp:positionH>
+            <wp:positionV relativeFrom="paragraph">
+              <wp:posOffset>175528</wp:posOffset>
+            </wp:positionV>
+            <wp:extent cx="1642707" cy="2187788"/>
+            <wp:effectExtent l="0" t="0" r="0" b="3175"/>
+            <wp:wrapNone/>
+            <wp:docPr id="1937326250" name="Picture 1" descr="A screenshot of a login screen&#10;&#10;AI-generated content may be incorrect."/>
+            <wp:cNvGraphicFramePr>
+              <a:graphicFrameLocks xmlns:a="http://schemas.openxmlformats.org/drawingml/2006/main" noChangeAspect="1"/>
+            </wp:cNvGraphicFramePr>
+            <a:graphic xmlns:a="http://schemas.openxmlformats.org/drawingml/2006/main">
+              <a:graphicData uri="http://schemas.openxmlformats.org/drawingml/2006/picture">
+                <pic:pic xmlns:pic="http://schemas.openxmlformats.org/drawingml/2006/picture">
+                  <pic:nvPicPr>
+                    <pic:cNvPr id="1937326250" name="Picture 1" descr="A screenshot of a login screen&#10;&#10;AI-generated content may be incorrect."/>
+                    <pic:cNvPicPr/>
+                  </pic:nvPicPr>
+                  <pic:blipFill>
+                    <a:blip r:embed="rId7" cstate="print">
+                      <a:extLst>
+                        <a:ext uri="{28A0092B-C50C-407E-A947-70E740481C1C}">
+                          <a14:useLocalDpi xmlns:a14="http://schemas.microsoft.com/office/drawing/2010/main" val="0"/>
+                        </a:ext>
+                      </a:extLst>
+                    </a:blip>
+                    <a:stretch>
+                      <a:fillRect/>
+                    </a:stretch>
+                  </pic:blipFill>
+                  <pic:spPr>
+                    <a:xfrm>
+                      <a:off x="0" y="0"/>
+                      <a:ext cx="1642707" cy="2187788"/>
+                    </a:xfrm>
+                    <a:prstGeom prst="rect">
+                      <a:avLst/>
+                    </a:prstGeom>
+                  </pic:spPr>
+                </pic:pic>
+              </a:graphicData>
+            </a:graphic>
+            <wp14:sizeRelH relativeFrom="margin">
+              <wp14:pctWidth>0</wp14:pctWidth>
+            </wp14:sizeRelH>
+            <wp14:sizeRelV relativeFrom="margin">
+              <wp14:pctHeight>0</wp14:pctHeight>
+            </wp14:sizeRelV>
+          </wp:anchor>
+        </w:drawing>
+      </w:r>
+      <w:r>
+        <w:rPr>
+          <w:lang w:val="en-GB"/>
+        </w:rPr>
+        <w:tab/>
+      </w:r>
+      <w:r>
+        <w:rPr>
+          <w:lang w:val="en-GB"/>
+        </w:rPr>
+        <w:tab/>
+      </w:r>
+      <w:r>
+        <w:rPr>
+          <w:lang w:val="en-GB"/>
+        </w:rPr>
+        <w:tab/>
+      </w:r>
+      <w:r>
+        <w:rPr>
+          <w:lang w:val="en-GB"/>
+        </w:rPr>
+        <w:tab/>
+      </w:r>
+      <w:r>
+        <w:rPr>
+          <w:lang w:val="en-GB"/>
+        </w:rPr>
+        <w:tab/>
+      </w:r>
+    </w:p>
+    <w:p>
+      <w:pPr>
+        <w:rPr>
+          <w:lang w:val="en-GB"/>
+        </w:rPr>
+      </w:pPr>
+      <w:r>
+        <w:rPr>
+          <w:lang w:val="en-GB"/>
+        </w:rPr>
+        <w:br w:type="page"/>
+      </w:r>
+    </w:p>
+    <w:p>
+      <w:pPr>
+        <w:pStyle w:val="ListParagraph"/>
+        <w:numPr>
+          <w:ilvl w:val="0"/>
+          <w:numId w:val="1"/>
+        </w:numPr>
+        <w:rPr>
+          <w:lang w:val="en-GB"/>
+        </w:rPr>
+      </w:pPr>
+      <w:r>
+        <w:rPr>
+          <w:lang w:val="en-GB"/>
+        </w:rPr>
+        <w:lastRenderedPageBreak/>
+        <w:t xml:space="preserve">Once connected the WiFi Hotspot created will no longer be available. The gateway will go from </w:t>
+      </w:r>
+      <w:r>
+        <w:rPr>
+          <w:lang w:val="en-GB"/>
+        </w:rPr>
+        <w:t>Access point mode to Station mode.</w:t>
+      </w:r>
+    </w:p>
+    <w:p>
+      <w:pPr>
+        <w:pStyle w:val="ListParagraph"/>
+        <w:numPr>
+          <w:ilvl w:val="0"/>
+          <w:numId w:val="1"/>
+        </w:numPr>
+        <w:rPr>
+          <w:lang w:val="en-GB"/>
+        </w:rPr>
+      </w:pPr>
+      <w:r>
+        <w:rPr>
+          <w:lang w:val="en-GB"/>
+        </w:rPr>
+        <w:t>Go to the WiFi settings of your phone</w:t>
+      </w:r>
+    </w:p>
+    <w:p>
+      <w:pPr>
+        <w:pStyle w:val="ListParagraph"/>
+        <w:numPr>
           <w:ilvl w:val="1"/>
           <w:numId w:val="1"/>
         </w:numPr>
@@ -324,66 +731,6 @@
         <w:rPr>
           <w:lang w:val="en-GB"/>
         </w:rPr>
-        <w:t>Sdfsd</w:t>
-      </w:r>
-    </w:p>
-    <w:p>
-      <w:pPr>
-        <w:pStyle w:val="ListParagraph"/>
-        <w:numPr>
-          <w:ilvl w:val="0"/>
-          <w:numId w:val="1"/>
-        </w:numPr>
-        <w:rPr>
-          <w:lang w:val="en-GB"/>
-        </w:rPr>
-      </w:pPr>
-      <w:r>
-        <w:rPr>
-          <w:lang w:val="en-GB"/>
-        </w:rPr>
-        <w:t xml:space="preserve">Once connected the WiFi Hotspot created will no longer be available. The gateway will go from </w:t>
-      </w:r>
-      <w:r>
-        <w:rPr>
-          <w:lang w:val="en-GB"/>
-        </w:rPr>
-        <w:t>Access point mode to Station mode.</w:t>
-      </w:r>
-    </w:p>
-    <w:p>
-      <w:pPr>
-        <w:pStyle w:val="ListParagraph"/>
-        <w:numPr>
-          <w:ilvl w:val="0"/>
-          <w:numId w:val="1"/>
-        </w:numPr>
-        <w:rPr>
-          <w:lang w:val="en-GB"/>
-        </w:rPr>
-      </w:pPr>
-      <w:r>
-        <w:rPr>
-          <w:lang w:val="en-GB"/>
-        </w:rPr>
-        <w:t>Go to the WiFi settings of your phone</w:t>
-      </w:r>
-    </w:p>
-    <w:p>
-      <w:pPr>
-        <w:pStyle w:val="ListParagraph"/>
-        <w:numPr>
-          <w:ilvl w:val="1"/>
-          <w:numId w:val="1"/>
-        </w:numPr>
-        <w:rPr>
-          <w:lang w:val="en-GB"/>
-        </w:rPr>
-      </w:pPr>
-      <w:r>
-        <w:rPr>
-          <w:lang w:val="en-GB"/>
-        </w:rPr>
         <w:t>Connect to the same WiFi network as the gateway.</w:t>
       </w:r>
     </w:p>
@@ -735,7 +1082,6 @@
         <w:rPr>
           <w:lang w:val="en-GB"/>
         </w:rPr>
-        <w:lastRenderedPageBreak/>
         <w:t>Wait for the Gateway to power up</w:t>
       </w:r>
     </w:p>
@@ -811,19 +1157,19 @@
         <w:rPr>
           <w:lang w:val="en-GB"/>
         </w:rPr>
-        <w:t>Download and in</w:t>
-      </w:r>
-      <w:r>
-        <w:rPr>
-          <w:lang w:val="en-GB"/>
-        </w:rPr>
-        <w:t xml:space="preserve">stall </w:t>
-      </w:r>
-      <w:r>
-        <w:rPr>
-          <w:lang w:val="en-GB"/>
-        </w:rPr>
-        <w:t xml:space="preserve">Advanced IP Scanner. </w:t>
+        <w:t xml:space="preserve">There are two ways to find and connect to the </w:t>
+      </w:r>
+      <w:r>
+        <w:rPr>
+          <w:lang w:val="en-GB"/>
+        </w:rPr>
+        <w:t xml:space="preserve">gateway on your local network. One by using an IP Scanner tool, two by logging into your WiFi router and </w:t>
+      </w:r>
+      <w:r>
+        <w:rPr>
+          <w:lang w:val="en-GB"/>
+        </w:rPr>
+        <w:t>seeing all the devices listed there.</w:t>
       </w:r>
     </w:p>
     <w:p>
@@ -834,10 +1180,70 @@
           <w:numId w:val="3"/>
         </w:numPr>
         <w:rPr>
-          <w:lang w:val="en-GB"/>
-        </w:rPr>
-      </w:pPr>
-      <w:hyperlink r:id="rId5" w:history="1">
+          <w:b/>
+          <w:bCs/>
+          <w:lang w:val="en-GB"/>
+        </w:rPr>
+      </w:pPr>
+      <w:r>
+        <w:rPr>
+          <w:b/>
+          <w:bCs/>
+          <w:lang w:val="en-GB"/>
+        </w:rPr>
+        <w:t xml:space="preserve">Method </w:t>
+      </w:r>
+      <w:r>
+        <w:rPr>
+          <w:b/>
+          <w:bCs/>
+          <w:lang w:val="en-GB"/>
+        </w:rPr>
+        <w:t>One, by using an IP Scanner tool</w:t>
+      </w:r>
+    </w:p>
+    <w:p>
+      <w:pPr>
+        <w:pStyle w:val="ListParagraph"/>
+        <w:numPr>
+          <w:ilvl w:val="2"/>
+          <w:numId w:val="3"/>
+        </w:numPr>
+        <w:rPr>
+          <w:lang w:val="en-GB"/>
+        </w:rPr>
+      </w:pPr>
+      <w:r>
+        <w:rPr>
+          <w:lang w:val="en-GB"/>
+        </w:rPr>
+        <w:t>Download and in</w:t>
+      </w:r>
+      <w:r>
+        <w:rPr>
+          <w:lang w:val="en-GB"/>
+        </w:rPr>
+        <w:t xml:space="preserve">stall </w:t>
+      </w:r>
+      <w:r>
+        <w:rPr>
+          <w:lang w:val="en-GB"/>
+        </w:rPr>
+        <w:t xml:space="preserve">Advanced IP Scanner. </w:t>
+      </w:r>
+    </w:p>
+    <w:p>
+      <w:pPr>
+        <w:pStyle w:val="ListParagraph"/>
+        <w:numPr>
+          <w:ilvl w:val="2"/>
+          <w:numId w:val="3"/>
+        </w:numPr>
+        <w:rPr>
+          <w:lang w:val="en-GB"/>
+        </w:rPr>
+      </w:pPr>
+      <w:hyperlink r:id="rId8" w:history="1">
         <w:r>
           <w:rPr>
             <w:rStyle w:val="Hyperlink"/>
@@ -851,6 +1257,138 @@
       <w:pPr>
         <w:pStyle w:val="ListParagraph"/>
         <w:numPr>
+          <w:ilvl w:val="2"/>
+          <w:numId w:val="3"/>
+        </w:numPr>
+        <w:rPr>
+          <w:lang w:val="en-GB"/>
+        </w:rPr>
+      </w:pPr>
+      <w:r>
+        <w:rPr>
+          <w:lang w:val="en-GB"/>
+        </w:rPr>
+        <w:t>Scan the range of you local WiFi Netwo</w:t>
+      </w:r>
+      <w:r>
+        <w:rPr>
+          <w:lang w:val="en-GB"/>
+        </w:rPr>
+        <w:t>r</w:t>
+      </w:r>
+      <w:r>
+        <w:rPr>
+          <w:lang w:val="en-GB"/>
+        </w:rPr>
+        <w:t>k</w:t>
+      </w:r>
+    </w:p>
+    <w:p>
+      <w:pPr>
+        <w:pStyle w:val="ListParagraph"/>
+        <w:numPr>
+          <w:ilvl w:val="2"/>
+          <w:numId w:val="3"/>
+        </w:numPr>
+        <w:rPr>
+          <w:lang w:val="en-GB"/>
+        </w:rPr>
+      </w:pPr>
+      <w:r>
+        <w:rPr>
+          <w:lang w:val="en-GB"/>
+        </w:rPr>
+        <w:t xml:space="preserve">Look for </w:t>
+      </w:r>
+      <w:r>
+        <w:rPr>
+          <w:lang w:val="en-GB"/>
+        </w:rPr>
+        <w:t>AmpX-Energy-Gateway.lan</w:t>
+      </w:r>
+    </w:p>
+    <w:p>
+      <w:pPr>
+        <w:pStyle w:val="ListParagraph"/>
+        <w:numPr>
+          <w:ilvl w:val="3"/>
+          <w:numId w:val="3"/>
+        </w:numPr>
+        <w:rPr>
+          <w:lang w:val="en-GB"/>
+        </w:rPr>
+      </w:pPr>
+      <w:r>
+        <w:rPr>
+          <w:lang w:val="en-GB"/>
+        </w:rPr>
+        <w:t>Right click on it and copy the ip address.</w:t>
+      </w:r>
+    </w:p>
+    <w:p>
+      <w:pPr>
+        <w:pStyle w:val="ListParagraph"/>
+        <w:numPr>
+          <w:ilvl w:val="3"/>
+          <w:numId w:val="3"/>
+        </w:numPr>
+        <w:rPr>
+          <w:lang w:val="en-GB"/>
+        </w:rPr>
+      </w:pPr>
+      <w:r>
+        <w:rPr>
+          <w:lang w:val="en-GB"/>
+        </w:rPr>
+        <w:t>Paste this IP address in your browser.</w:t>
+      </w:r>
+    </w:p>
+    <w:p>
+      <w:pPr>
+        <w:pStyle w:val="ListParagraph"/>
+        <w:numPr>
+          <w:ilvl w:val="3"/>
+          <w:numId w:val="3"/>
+        </w:numPr>
+        <w:rPr>
+          <w:lang w:val="en-GB"/>
+        </w:rPr>
+      </w:pPr>
+      <w:r>
+        <w:rPr>
+          <w:lang w:val="en-GB"/>
+        </w:rPr>
+        <w:t xml:space="preserve">This should open up the local web page of the gateway </w:t>
+      </w:r>
+      <w:r>
+        <w:rPr>
+          <w:lang w:val="en-GB"/>
+        </w:rPr>
+        <w:t>and list live meter readings.</w:t>
+      </w:r>
+    </w:p>
+    <w:p>
+      <w:pPr>
+        <w:pStyle w:val="ListParagraph"/>
+        <w:numPr>
+          <w:ilvl w:val="2"/>
+          <w:numId w:val="3"/>
+        </w:numPr>
+        <w:rPr>
+          <w:lang w:val="en-GB"/>
+        </w:rPr>
+      </w:pPr>
+      <w:r>
+        <w:rPr>
+          <w:lang w:val="en-GB"/>
+        </w:rPr>
+        <w:t>Wait 2 minutes for the initial values to appear</w:t>
+      </w:r>
+    </w:p>
+    <w:p>
+      <w:pPr>
+        <w:pStyle w:val="ListParagraph"/>
+        <w:numPr>
           <w:ilvl w:val="1"/>
           <w:numId w:val="3"/>
         </w:numPr>
@@ -860,45 +1398,19 @@
       </w:pPr>
       <w:r>
         <w:rPr>
-          <w:lang w:val="en-GB"/>
-        </w:rPr>
-        <w:t>Scan the range of you local WiFi Netwo</w:t>
-      </w:r>
-      <w:r>
-        <w:rPr>
-          <w:lang w:val="en-GB"/>
-        </w:rPr>
-        <w:t>r</w:t>
-      </w:r>
-      <w:r>
-        <w:rPr>
-          <w:lang w:val="en-GB"/>
-        </w:rPr>
-        <w:t>k</w:t>
-      </w:r>
-    </w:p>
-    <w:p>
-      <w:pPr>
-        <w:pStyle w:val="ListParagraph"/>
-        <w:numPr>
-          <w:ilvl w:val="1"/>
-          <w:numId w:val="3"/>
-        </w:numPr>
-        <w:rPr>
-          <w:lang w:val="en-GB"/>
-        </w:rPr>
-      </w:pPr>
-      <w:r>
-        <w:rPr>
-          <w:lang w:val="en-GB"/>
-        </w:rPr>
-        <w:t xml:space="preserve">Look for </w:t>
-      </w:r>
-      <w:r>
-        <w:rPr>
-          <w:lang w:val="en-GB"/>
-        </w:rPr>
-        <w:t>AmpX-Energy-Gateway.lan</w:t>
+          <w:b/>
+          <w:bCs/>
+          <w:lang w:val="en-GB"/>
+        </w:rPr>
+        <w:t xml:space="preserve">Method </w:t>
+      </w:r>
+      <w:r>
+        <w:rPr>
+          <w:b/>
+          <w:bCs/>
+          <w:lang w:val="en-GB"/>
+        </w:rPr>
+        <w:t>Two, by logging into your router.</w:t>
       </w:r>
     </w:p>
     <w:p>
@@ -916,7 +1428,7 @@
         <w:rPr>
           <w:lang w:val="en-GB"/>
         </w:rPr>
-        <w:t>Right click on it and copy the ip address.</w:t>
+        <w:t>Type in the address of your router.</w:t>
       </w:r>
     </w:p>
     <w:p>
@@ -934,8 +1446,17 @@
         <w:rPr>
           <w:lang w:val="en-GB"/>
         </w:rPr>
-        <w:t>Paste this IP address in your browser.</w:t>
-      </w:r>
+        <w:t xml:space="preserve">For example: </w:t>
+      </w:r>
+      <w:hyperlink r:id="rId9" w:history="1">
+        <w:r>
+          <w:rPr>
+            <w:rStyle w:val="Hyperlink"/>
+            <w:lang w:val="en-GB"/>
+          </w:rPr>
+          <w:t>http://192.168.2.1/</w:t>
+        </w:r>
+      </w:hyperlink>
     </w:p>
     <w:p>
       <w:pPr>
@@ -952,20 +1473,15 @@
         <w:rPr>
           <w:lang w:val="en-GB"/>
         </w:rPr>
-        <w:t xml:space="preserve">This should open up the local web page of the gateway </w:t>
-      </w:r>
-      <w:r>
-        <w:rPr>
-          <w:lang w:val="en-GB"/>
-        </w:rPr>
-        <w:t>and list live meter readings.</w:t>
-      </w:r>
-    </w:p>
-    <w:p>
-      <w:pPr>
-        <w:pStyle w:val="ListParagraph"/>
-        <w:numPr>
-          <w:ilvl w:val="1"/>
+        <w:lastRenderedPageBreak/>
+        <w:t>Login with your username and password.</w:t>
+      </w:r>
+    </w:p>
+    <w:p>
+      <w:pPr>
+        <w:pStyle w:val="ListParagraph"/>
+        <w:numPr>
+          <w:ilvl w:val="2"/>
           <w:numId w:val="3"/>
         </w:numPr>
         <w:rPr>
@@ -976,8 +1492,198 @@
         <w:rPr>
           <w:lang w:val="en-GB"/>
         </w:rPr>
-        <w:t>Wait 2 minutes for the initial values to appear</w:t>
-      </w:r>
+        <w:t>Look for “</w:t>
+      </w:r>
+      <w:r>
+        <w:rPr>
+          <w:lang w:val="en-GB"/>
+        </w:rPr>
+        <w:t>AmpX-Energy-Gateway</w:t>
+      </w:r>
+      <w:r>
+        <w:rPr>
+          <w:lang w:val="en-GB"/>
+        </w:rPr>
+        <w:t>” on the device list.</w:t>
+      </w:r>
+    </w:p>
+    <w:p>
+      <w:pPr>
+        <w:pStyle w:val="ListParagraph"/>
+        <w:numPr>
+          <w:ilvl w:val="2"/>
+          <w:numId w:val="3"/>
+        </w:numPr>
+        <w:rPr>
+          <w:lang w:val="en-GB"/>
+        </w:rPr>
+      </w:pPr>
+      <w:r>
+        <w:rPr>
+          <w:lang w:val="en-GB"/>
+        </w:rPr>
+        <w:t>Copy the device IP address.</w:t>
+      </w:r>
+    </w:p>
+    <w:p>
+      <w:pPr>
+        <w:pStyle w:val="ListParagraph"/>
+        <w:numPr>
+          <w:ilvl w:val="2"/>
+          <w:numId w:val="3"/>
+        </w:numPr>
+        <w:rPr>
+          <w:lang w:val="en-GB"/>
+        </w:rPr>
+      </w:pPr>
+      <w:r>
+        <w:rPr>
+          <w:lang w:val="en-GB"/>
+        </w:rPr>
+        <w:t>Paste the IP address in your browser.</w:t>
+      </w:r>
+    </w:p>
+    <w:p>
+      <w:pPr>
+        <w:rPr>
+          <w:b/>
+          <w:bCs/>
+          <w:lang w:val="en-GB"/>
+        </w:rPr>
+      </w:pPr>
+      <w:r>
+        <w:rPr>
+          <w:b/>
+          <w:bCs/>
+          <w:lang w:val="en-GB"/>
+        </w:rPr>
+        <w:t>Router login screen example</w:t>
+      </w:r>
+    </w:p>
+    <w:p>
+      <w:pPr>
+        <w:rPr>
+          <w:lang w:val="en-GB"/>
+        </w:rPr>
+      </w:pPr>
+      <w:r>
+        <w:rPr>
+          <w:lang w:val="en-GB"/>
+        </w:rPr>
+        <w:drawing>
+          <wp:inline distT="0" distB="0" distL="0" distR="0" wp14:anchorId="2F601BDE" wp14:editId="1DB8124C">
+            <wp:extent cx="5731510" cy="3335020"/>
+            <wp:effectExtent l="0" t="0" r="2540" b="0"/>
+            <wp:docPr id="2134845617" name="Picture 1" descr="A screen shot of a device&#10;&#10;AI-generated content may be incorrect."/>
+            <wp:cNvGraphicFramePr>
+              <a:graphicFrameLocks xmlns:a="http://schemas.openxmlformats.org/drawingml/2006/main" noChangeAspect="1"/>
+            </wp:cNvGraphicFramePr>
+            <a:graphic xmlns:a="http://schemas.openxmlformats.org/drawingml/2006/main">
+              <a:graphicData uri="http://schemas.openxmlformats.org/drawingml/2006/picture">
+                <pic:pic xmlns:pic="http://schemas.openxmlformats.org/drawingml/2006/picture">
+                  <pic:nvPicPr>
+                    <pic:cNvPr id="2134845617" name="Picture 1" descr="A screen shot of a device&#10;&#10;AI-generated content may be incorrect."/>
+                    <pic:cNvPicPr/>
+                  </pic:nvPicPr>
+                  <pic:blipFill>
+                    <a:blip r:embed="rId10"/>
+                    <a:stretch>
+                      <a:fillRect/>
+                    </a:stretch>
+                  </pic:blipFill>
+                  <pic:spPr>
+                    <a:xfrm>
+                      <a:off x="0" y="0"/>
+                      <a:ext cx="5731510" cy="3335020"/>
+                    </a:xfrm>
+                    <a:prstGeom prst="rect">
+                      <a:avLst/>
+                    </a:prstGeom>
+                  </pic:spPr>
+                </pic:pic>
+              </a:graphicData>
+            </a:graphic>
+          </wp:inline>
+        </w:drawing>
+      </w:r>
+    </w:p>
+    <w:p>
+      <w:pPr>
+        <w:rPr>
+          <w:b/>
+          <w:bCs/>
+          <w:lang w:val="en-GB"/>
+        </w:rPr>
+      </w:pPr>
+      <w:r>
+        <w:rPr>
+          <w:b/>
+          <w:bCs/>
+          <w:lang w:val="en-GB"/>
+        </w:rPr>
+        <w:t>Device list example</w:t>
+      </w:r>
+    </w:p>
+    <w:p>
+      <w:pPr>
+        <w:rPr>
+          <w:lang w:val="en-GB"/>
+        </w:rPr>
+      </w:pPr>
+      <w:r>
+        <w:rPr>
+          <w:lang w:val="en-GB"/>
+        </w:rPr>
+        <w:drawing>
+          <wp:inline distT="0" distB="0" distL="0" distR="0" wp14:anchorId="042072B9" wp14:editId="0DC6295C">
+            <wp:extent cx="5731510" cy="1869440"/>
+            <wp:effectExtent l="0" t="0" r="2540" b="0"/>
+            <wp:docPr id="592408283" name="Picture 1" descr="A screenshot of a phone&#10;&#10;AI-generated content may be incorrect."/>
+            <wp:cNvGraphicFramePr>
+              <a:graphicFrameLocks xmlns:a="http://schemas.openxmlformats.org/drawingml/2006/main" noChangeAspect="1"/>
+            </wp:cNvGraphicFramePr>
+            <a:graphic xmlns:a="http://schemas.openxmlformats.org/drawingml/2006/main">
+              <a:graphicData uri="http://schemas.openxmlformats.org/drawingml/2006/picture">
+                <pic:pic xmlns:pic="http://schemas.openxmlformats.org/drawingml/2006/picture">
+                  <pic:nvPicPr>
+                    <pic:cNvPr id="592408283" name="Picture 1" descr="A screenshot of a phone&#10;&#10;AI-generated content may be incorrect."/>
+                    <pic:cNvPicPr/>
+                  </pic:nvPicPr>
+                  <pic:blipFill>
+                    <a:blip r:embed="rId11"/>
+                    <a:stretch>
+                      <a:fillRect/>
+                    </a:stretch>
+                  </pic:blipFill>
+                  <pic:spPr>
+                    <a:xfrm>
+                      <a:off x="0" y="0"/>
+                      <a:ext cx="5731510" cy="1869440"/>
+                    </a:xfrm>
+                    <a:prstGeom prst="rect">
+                      <a:avLst/>
+                    </a:prstGeom>
+                  </pic:spPr>
+                </pic:pic>
+              </a:graphicData>
+            </a:graphic>
+          </wp:inline>
+        </w:drawing>
+      </w:r>
+    </w:p>
+    <w:p>
+      <w:pPr>
+        <w:rPr>
+          <w:lang w:val="en-GB"/>
+        </w:rPr>
+      </w:pPr>
+    </w:p>
+    <w:p>
+      <w:pPr>
+        <w:rPr>
+          <w:lang w:val="en-GB"/>
+        </w:rPr>
+      </w:pPr>
     </w:p>
     <w:p>
       <w:pPr>
@@ -1208,6 +1914,95 @@
     </w:lvl>
   </w:abstractNum>
   <w:abstractNum w:abstractNumId="1" w15:restartNumberingAfterBreak="0">
+    <w:nsid w:val="160B60D6"/>
+    <w:multiLevelType w:val="hybridMultilevel"/>
+    <w:tmpl w:val="DCA8B322"/>
+    <w:lvl w:ilvl="0" w:tplc="1000000F">
+      <w:start w:val="1"/>
+      <w:numFmt w:val="decimal"/>
+      <w:lvlText w:val="%1."/>
+      <w:lvlJc w:val="left"/>
+      <w:pPr>
+        <w:ind w:left="720" w:hanging="360"/>
+      </w:pPr>
+      <w:rPr>
+        <w:rFonts w:hint="default"/>
+      </w:rPr>
+    </w:lvl>
+    <w:lvl w:ilvl="1" w:tplc="10000019" w:tentative="1">
+      <w:start w:val="1"/>
+      <w:numFmt w:val="lowerLetter"/>
+      <w:lvlText w:val="%2."/>
+      <w:lvlJc w:val="left"/>
+      <w:pPr>
+        <w:ind w:left="1440" w:hanging="360"/>
+      </w:pPr>
+    </w:lvl>
+    <w:lvl w:ilvl="2" w:tplc="1000001B" w:tentative="1">
+      <w:start w:val="1"/>
+      <w:numFmt w:val="lowerRoman"/>
+      <w:lvlText w:val="%3."/>
+      <w:lvlJc w:val="right"/>
+      <w:pPr>
+        <w:ind w:left="2160" w:hanging="180"/>
+      </w:pPr>
+    </w:lvl>
+    <w:lvl w:ilvl="3" w:tplc="1000000F" w:tentative="1">
+      <w:start w:val="1"/>
+      <w:numFmt w:val="decimal"/>
+      <w:lvlText w:val="%4."/>
+      <w:lvlJc w:val="left"/>
+      <w:pPr>
+        <w:ind w:left="2880" w:hanging="360"/>
+      </w:pPr>
+    </w:lvl>
+    <w:lvl w:ilvl="4" w:tplc="10000019" w:tentative="1">
+      <w:start w:val="1"/>
+      <w:numFmt w:val="lowerLetter"/>
+      <w:lvlText w:val="%5."/>
+      <w:lvlJc w:val="left"/>
+      <w:pPr>
+        <w:ind w:left="3600" w:hanging="360"/>
+      </w:pPr>
+    </w:lvl>
+    <w:lvl w:ilvl="5" w:tplc="1000001B" w:tentative="1">
+      <w:start w:val="1"/>
+      <w:numFmt w:val="lowerRoman"/>
+      <w:lvlText w:val="%6."/>
+      <w:lvlJc w:val="right"/>
+      <w:pPr>
+        <w:ind w:left="4320" w:hanging="180"/>
+      </w:pPr>
+    </w:lvl>
+    <w:lvl w:ilvl="6" w:tplc="1000000F" w:tentative="1">
+      <w:start w:val="1"/>
+      <w:numFmt w:val="decimal"/>
+      <w:lvlText w:val="%7."/>
+      <w:lvlJc w:val="left"/>
+      <w:pPr>
+        <w:ind w:left="5040" w:hanging="360"/>
+      </w:pPr>
+    </w:lvl>
+    <w:lvl w:ilvl="7" w:tplc="10000019" w:tentative="1">
+      <w:start w:val="1"/>
+      <w:numFmt w:val="lowerLetter"/>
+      <w:lvlText w:val="%8."/>
+      <w:lvlJc w:val="left"/>
+      <w:pPr>
+        <w:ind w:left="5760" w:hanging="360"/>
+      </w:pPr>
+    </w:lvl>
+    <w:lvl w:ilvl="8" w:tplc="1000001B" w:tentative="1">
+      <w:start w:val="1"/>
+      <w:numFmt w:val="lowerRoman"/>
+      <w:lvlText w:val="%9."/>
+      <w:lvlJc w:val="right"/>
+      <w:pPr>
+        <w:ind w:left="6480" w:hanging="180"/>
+      </w:pPr>
+    </w:lvl>
+  </w:abstractNum>
+  <w:abstractNum w:abstractNumId="2" w15:restartNumberingAfterBreak="0">
     <w:nsid w:val="27A35B07"/>
     <w:multiLevelType w:val="hybridMultilevel"/>
     <w:tmpl w:val="CFC8B72E"/>
@@ -1320,7 +2115,7 @@
       </w:rPr>
     </w:lvl>
   </w:abstractNum>
-  <w:abstractNum w:abstractNumId="2" w15:restartNumberingAfterBreak="0">
+  <w:abstractNum w:abstractNumId="3" w15:restartNumberingAfterBreak="0">
     <w:nsid w:val="69CE4A98"/>
     <w:multiLevelType w:val="hybridMultilevel"/>
     <w:tmpl w:val="F7D65520"/>
@@ -1360,7 +2155,7 @@
         <w:rFonts w:ascii="Wingdings" w:hAnsi="Wingdings" w:hint="default"/>
       </w:rPr>
     </w:lvl>
-    <w:lvl w:ilvl="3" w:tplc="10000001" w:tentative="1">
+    <w:lvl w:ilvl="3" w:tplc="10000001">
       <w:start w:val="1"/>
       <w:numFmt w:val="bullet"/>
       <w:lvlText w:val=""/>
@@ -1437,10 +2232,13 @@
     <w:abstractNumId w:val="0"/>
   </w:num>
   <w:num w:numId="2" w16cid:durableId="1018970360">
-    <w:abstractNumId w:val="1"/>
+    <w:abstractNumId w:val="2"/>
   </w:num>
   <w:num w:numId="3" w16cid:durableId="1202667476">
-    <w:abstractNumId w:val="2"/>
+    <w:abstractNumId w:val="3"/>
+  </w:num>
+  <w:num w:numId="4" w16cid:durableId="1755711627">
+    <w:abstractNumId w:val="1"/>
   </w:num>
 </w:numbering>
 </file>

</xml_diff>